<commit_message>
docs(v2): W-C final-review fixes - v8 tables + TOC + thesis mapping table
Codex final sign-off caught 3 doc blockers, all fixed: v8 preserved tables no longer contradict the body (RAPTOR/Cross status scoped to the batch-9 acceptance config with code defaults still off, multi-round consultation wording, group-chat workbench page list), 6.6 body paragraphs demoted from Heading 2 so the TOC is clean (Word COM re-verified, 13 pages / 14 tables), thesis gains the literal old-module mapping table (six rows, destination + replace/delete reason; re-rendered 20 pages / 1 table). Backups synced. Co-Authored-By: Claude Fable 5 <noreply@anthropic.com>
</commit_message>
<xml_diff>
--- a/backups/毕业论文_v2_更新版.docx
+++ b/backups/毕业论文_v2_更新版.docx
@@ -90,6 +90,15 @@
     <w:p>
       <w:pPr>
         <w:pStyle w:val="GuideTOC"/>
+        <w:ind w:left="317"/>
+      </w:pPr>
+      <w:r>
+        <w:t>旧稿模块映射表</w:t>
+      </w:r>
+    </w:p>
+    <w:p>
+      <w:pPr>
+        <w:pStyle w:val="GuideTOC"/>
       </w:pPr>
       <w:r>
         <w:rPr>
@@ -456,6 +465,7 @@
         <w:ind w:left="317"/>
       </w:pPr>
       <w:r>
+        <w:lastRenderedPageBreak/>
         <w:t>目标</w:t>
       </w:r>
     </w:p>
@@ -465,7 +475,6 @@
         <w:ind w:left="317"/>
       </w:pPr>
       <w:r>
-        <w:lastRenderedPageBreak/>
         <w:t>用户交互与数据流程</w:t>
       </w:r>
     </w:p>
@@ -741,9 +750,558 @@
     </w:p>
     <w:p>
       <w:pPr>
+        <w:pStyle w:val="21"/>
+      </w:pPr>
+      <w:r>
+        <w:t>旧稿模块映射表</w:t>
+      </w:r>
+    </w:p>
+    <w:p>
+      <w:r>
+        <w:t>下表逐项说明</w:t>
+      </w:r>
+      <w:r>
+        <w:t xml:space="preserve"> 2026-01 </w:t>
+      </w:r>
+      <w:r>
+        <w:t>概念稿的每个模块在本稿中的去向，以及被替换或删除的原因。</w:t>
+      </w:r>
+    </w:p>
+    <w:tbl>
+      <w:tblPr>
+        <w:tblStyle w:val="aff1"/>
+        <w:tblW w:w="0" w:type="auto"/>
+        <w:tblLook w:val="04A0" w:firstRow="1" w:lastRow="0" w:firstColumn="1" w:lastColumn="0" w:noHBand="0" w:noVBand="1"/>
+      </w:tblPr>
+      <w:tblGrid>
+        <w:gridCol w:w="3173"/>
+        <w:gridCol w:w="3173"/>
+        <w:gridCol w:w="3173"/>
+      </w:tblGrid>
+      <w:tr>
+        <w:trPr>
+          <w:tblHeader/>
+        </w:trPr>
+        <w:tc>
+          <w:tcPr>
+            <w:tcW w:w="3173" w:type="dxa"/>
+            <w:shd w:val="clear" w:color="auto" w:fill="D9EAF7"/>
+          </w:tcPr>
+          <w:p>
+            <w:pPr>
+              <w:spacing w:after="40"/>
+            </w:pPr>
+            <w:r>
+              <w:rPr>
+                <w:b/>
+              </w:rPr>
+              <w:t>旧稿模块</w:t>
+            </w:r>
+          </w:p>
+        </w:tc>
+        <w:tc>
+          <w:tcPr>
+            <w:tcW w:w="3173" w:type="dxa"/>
+            <w:shd w:val="clear" w:color="auto" w:fill="D9EAF7"/>
+          </w:tcPr>
+          <w:p>
+            <w:pPr>
+              <w:spacing w:after="40"/>
+            </w:pPr>
+            <w:r>
+              <w:rPr>
+                <w:b/>
+              </w:rPr>
+              <w:t>本稿去向</w:t>
+            </w:r>
+          </w:p>
+        </w:tc>
+        <w:tc>
+          <w:tcPr>
+            <w:tcW w:w="3173" w:type="dxa"/>
+            <w:shd w:val="clear" w:color="auto" w:fill="D9EAF7"/>
+          </w:tcPr>
+          <w:p>
+            <w:pPr>
+              <w:spacing w:after="40"/>
+            </w:pPr>
+            <w:r>
+              <w:rPr>
+                <w:b/>
+              </w:rPr>
+              <w:t>替换</w:t>
+            </w:r>
+            <w:r>
+              <w:rPr>
+                <w:b/>
+              </w:rPr>
+              <w:t xml:space="preserve"> / </w:t>
+            </w:r>
+            <w:r>
+              <w:rPr>
+                <w:b/>
+              </w:rPr>
+              <w:t>删除原因</w:t>
+            </w:r>
+          </w:p>
+        </w:tc>
+      </w:tr>
+      <w:tr>
+        <w:tc>
+          <w:tcPr>
+            <w:tcW w:w="3173" w:type="dxa"/>
+          </w:tcPr>
+          <w:p>
+            <w:pPr>
+              <w:spacing w:after="40"/>
+            </w:pPr>
+            <w:r>
+              <w:t>模块一：简历经历结构化</w:t>
+            </w:r>
+          </w:p>
+        </w:tc>
+        <w:tc>
+          <w:tcPr>
+            <w:tcW w:w="3173" w:type="dxa"/>
+          </w:tcPr>
+          <w:p>
+            <w:pPr>
+              <w:spacing w:after="40"/>
+            </w:pPr>
+            <w:r>
+              <w:t>模块一、二</w:t>
+            </w:r>
+          </w:p>
+        </w:tc>
+        <w:tc>
+          <w:tcPr>
+            <w:tcW w:w="3173" w:type="dxa"/>
+          </w:tcPr>
+          <w:p>
+            <w:pPr>
+              <w:spacing w:after="40"/>
+            </w:pPr>
+            <w:r>
+              <w:t>保留</w:t>
+            </w:r>
+            <w:r>
+              <w:t>“</w:t>
+            </w:r>
+            <w:r>
+              <w:t>把经历变成结构化事实</w:t>
+            </w:r>
+            <w:r>
+              <w:t>”</w:t>
+            </w:r>
+            <w:r>
+              <w:t>的目标；删除表单式逐段录入与独立</w:t>
+            </w:r>
+            <w:r>
+              <w:t>“</w:t>
+            </w:r>
+            <w:r>
+              <w:t>经历事实库</w:t>
+            </w:r>
+            <w:r>
+              <w:t>”</w:t>
+            </w:r>
+            <w:r>
+              <w:t>表设计</w:t>
+            </w:r>
+            <w:r>
+              <w:t>——</w:t>
+            </w:r>
+            <w:r>
+              <w:t>实际实现是整份简历上传后归一化并保留</w:t>
+            </w:r>
+            <w:r>
+              <w:t xml:space="preserve"> R### </w:t>
+            </w:r>
+            <w:r>
+              <w:t>原文证据，含糊处由澄清回路补齐。</w:t>
+            </w:r>
+          </w:p>
+        </w:tc>
+      </w:tr>
+      <w:tr>
+        <w:tc>
+          <w:tcPr>
+            <w:tcW w:w="3173" w:type="dxa"/>
+          </w:tcPr>
+          <w:p>
+            <w:pPr>
+              <w:spacing w:after="40"/>
+            </w:pPr>
+            <w:r>
+              <w:t>模块二：岗位描述解析与岗位画像</w:t>
+            </w:r>
+          </w:p>
+        </w:tc>
+        <w:tc>
+          <w:tcPr>
+            <w:tcW w:w="3173" w:type="dxa"/>
+          </w:tcPr>
+          <w:p>
+            <w:pPr>
+              <w:spacing w:after="40"/>
+            </w:pPr>
+            <w:r>
+              <w:t>模块三、四、六</w:t>
+            </w:r>
+          </w:p>
+        </w:tc>
+        <w:tc>
+          <w:tcPr>
+            <w:tcW w:w="3173" w:type="dxa"/>
+          </w:tcPr>
+          <w:p>
+            <w:pPr>
+              <w:spacing w:after="40"/>
+            </w:pPr>
+            <w:r>
+              <w:t>改为离线岗位入库（结构化字段</w:t>
+            </w:r>
+            <w:r>
+              <w:t xml:space="preserve"> + JD </w:t>
+            </w:r>
+            <w:r>
+              <w:t>原文块</w:t>
+            </w:r>
+            <w:r>
+              <w:t xml:space="preserve"> + </w:t>
+            </w:r>
+            <w:r>
+              <w:t>向量），由检索与</w:t>
+            </w:r>
+            <w:r>
+              <w:t xml:space="preserve"> Matching Agent </w:t>
+            </w:r>
+            <w:r>
+              <w:t>消费；删除</w:t>
+            </w:r>
+            <w:r>
+              <w:t>“</w:t>
+            </w:r>
+            <w:r>
+              <w:t>用户粘贴</w:t>
+            </w:r>
+            <w:r>
+              <w:t xml:space="preserve"> JD </w:t>
+            </w:r>
+            <w:r>
+              <w:t>后实时生成岗位画像</w:t>
+            </w:r>
+            <w:r>
+              <w:t>”</w:t>
+            </w:r>
+            <w:r>
+              <w:t>的交互假设。</w:t>
+            </w:r>
+          </w:p>
+        </w:tc>
+      </w:tr>
+      <w:tr>
+        <w:tc>
+          <w:tcPr>
+            <w:tcW w:w="3173" w:type="dxa"/>
+          </w:tcPr>
+          <w:p>
+            <w:pPr>
+              <w:spacing w:after="40"/>
+            </w:pPr>
+            <w:r>
+              <w:t>模块三：语义向量表示</w:t>
+            </w:r>
+          </w:p>
+        </w:tc>
+        <w:tc>
+          <w:tcPr>
+            <w:tcW w:w="3173" w:type="dxa"/>
+          </w:tcPr>
+          <w:p>
+            <w:pPr>
+              <w:spacing w:after="40"/>
+            </w:pPr>
+            <w:r>
+              <w:t>模块三、四</w:t>
+            </w:r>
+          </w:p>
+        </w:tc>
+        <w:tc>
+          <w:tcPr>
+            <w:tcW w:w="3173" w:type="dxa"/>
+          </w:tcPr>
+          <w:p>
+            <w:pPr>
+              <w:spacing w:after="40"/>
+            </w:pPr>
+            <w:r>
+              <w:t>保留</w:t>
+            </w:r>
+            <w:r>
+              <w:t xml:space="preserve"> Embedding </w:t>
+            </w:r>
+            <w:r>
+              <w:t>作为召回路线之一；删除</w:t>
+            </w:r>
+            <w:r>
+              <w:t>“</w:t>
+            </w:r>
+            <w:r>
+              <w:t>简历向量与岗位向量直接单路匹配</w:t>
+            </w:r>
+            <w:r>
+              <w:t>”</w:t>
+            </w:r>
+            <w:r>
+              <w:t>的设计</w:t>
+            </w:r>
+            <w:r>
+              <w:t>——</w:t>
+            </w:r>
+            <w:r>
+              <w:t>实际是</w:t>
+            </w:r>
+            <w:r>
+              <w:t xml:space="preserve"> SQL </w:t>
+            </w:r>
+            <w:r>
+              <w:t>硬过滤后</w:t>
+            </w:r>
+            <w:r>
+              <w:t xml:space="preserve"> BM25</w:t>
+            </w:r>
+            <w:r>
+              <w:t>、</w:t>
+            </w:r>
+            <w:r>
+              <w:t>Dense</w:t>
+            </w:r>
+            <w:r>
+              <w:t>、</w:t>
+            </w:r>
+            <w:r>
+              <w:t xml:space="preserve">RAPTOR </w:t>
+            </w:r>
+            <w:r>
+              <w:t>三路并行再融合。</w:t>
+            </w:r>
+          </w:p>
+        </w:tc>
+      </w:tr>
+      <w:tr>
+        <w:tc>
+          <w:tcPr>
+            <w:tcW w:w="3173" w:type="dxa"/>
+          </w:tcPr>
+          <w:p>
+            <w:pPr>
+              <w:spacing w:after="40"/>
+            </w:pPr>
+            <w:r>
+              <w:t>模块四：简历</w:t>
+            </w:r>
+            <w:r>
+              <w:t>—</w:t>
+            </w:r>
+            <w:r>
+              <w:t>岗位匹配</w:t>
+            </w:r>
+          </w:p>
+        </w:tc>
+        <w:tc>
+          <w:tcPr>
+            <w:tcW w:w="3173" w:type="dxa"/>
+          </w:tcPr>
+          <w:p>
+            <w:pPr>
+              <w:spacing w:after="40"/>
+            </w:pPr>
+            <w:r>
+              <w:t>模块四、五、八</w:t>
+            </w:r>
+          </w:p>
+        </w:tc>
+        <w:tc>
+          <w:tcPr>
+            <w:tcW w:w="3173" w:type="dxa"/>
+          </w:tcPr>
+          <w:p>
+            <w:pPr>
+              <w:spacing w:after="40"/>
+            </w:pPr>
+            <w:r>
+              <w:t>保留</w:t>
+            </w:r>
+            <w:r>
+              <w:t xml:space="preserve"> Top-K </w:t>
+            </w:r>
+            <w:r>
+              <w:t>排序目标；删除未实现的公司语境双层打分与固定</w:t>
+            </w:r>
+            <w:r>
+              <w:t xml:space="preserve"> 0.7/0.3 </w:t>
+            </w:r>
+            <w:r>
+              <w:t>加权公式，改为</w:t>
+            </w:r>
+            <w:r>
+              <w:t xml:space="preserve"> RRF </w:t>
+            </w:r>
+            <w:r>
+              <w:t>融合、加权评分与可回退的</w:t>
+            </w:r>
+            <w:r>
+              <w:t xml:space="preserve"> Cross-encoder </w:t>
+            </w:r>
+            <w:r>
+              <w:t>精排。</w:t>
+            </w:r>
+          </w:p>
+        </w:tc>
+      </w:tr>
+      <w:tr>
+        <w:tc>
+          <w:tcPr>
+            <w:tcW w:w="3173" w:type="dxa"/>
+          </w:tcPr>
+          <w:p>
+            <w:pPr>
+              <w:spacing w:after="40"/>
+            </w:pPr>
+            <w:r>
+              <w:t>模块五：</w:t>
+            </w:r>
+            <w:r>
+              <w:t xml:space="preserve">RAG </w:t>
+            </w:r>
+            <w:r>
+              <w:t>推荐解释</w:t>
+            </w:r>
+          </w:p>
+        </w:tc>
+        <w:tc>
+          <w:tcPr>
+            <w:tcW w:w="3173" w:type="dxa"/>
+          </w:tcPr>
+          <w:p>
+            <w:pPr>
+              <w:spacing w:after="40"/>
+            </w:pPr>
+            <w:r>
+              <w:t>模块一、四、六</w:t>
+            </w:r>
+          </w:p>
+        </w:tc>
+        <w:tc>
+          <w:tcPr>
+            <w:tcW w:w="3173" w:type="dxa"/>
+          </w:tcPr>
+          <w:p>
+            <w:pPr>
+              <w:spacing w:after="40"/>
+            </w:pPr>
+            <w:r>
+              <w:t>保留</w:t>
+            </w:r>
+            <w:r>
+              <w:t>“</w:t>
+            </w:r>
+            <w:r>
+              <w:t>解释必须有出处</w:t>
+            </w:r>
+            <w:r>
+              <w:t>”</w:t>
+            </w:r>
+            <w:r>
+              <w:t>的原则；出处从单一</w:t>
+            </w:r>
+            <w:r>
+              <w:t xml:space="preserve"> JD </w:t>
+            </w:r>
+            <w:r>
+              <w:t>检索扩展为</w:t>
+            </w:r>
+            <w:r>
+              <w:t xml:space="preserve"> R###/C### </w:t>
+            </w:r>
+            <w:r>
+              <w:t>简历证据与</w:t>
+            </w:r>
+            <w:r>
+              <w:t xml:space="preserve"> JD </w:t>
+            </w:r>
+            <w:r>
+              <w:t>原文块双链，并由</w:t>
+            </w:r>
+            <w:r>
+              <w:t xml:space="preserve"> Supervisor </w:t>
+            </w:r>
+            <w:r>
+              <w:t>做完整性核查。</w:t>
+            </w:r>
+          </w:p>
+        </w:tc>
+      </w:tr>
+      <w:tr>
+        <w:tc>
+          <w:tcPr>
+            <w:tcW w:w="3173" w:type="dxa"/>
+          </w:tcPr>
+          <w:p>
+            <w:pPr>
+              <w:spacing w:after="40"/>
+            </w:pPr>
+            <w:r>
+              <w:t>模块六：简历生成与导出</w:t>
+            </w:r>
+          </w:p>
+        </w:tc>
+        <w:tc>
+          <w:tcPr>
+            <w:tcW w:w="3173" w:type="dxa"/>
+          </w:tcPr>
+          <w:p>
+            <w:pPr>
+              <w:spacing w:after="40"/>
+            </w:pPr>
+            <w:r>
+              <w:t>模块六、八</w:t>
+            </w:r>
+          </w:p>
+        </w:tc>
+        <w:tc>
+          <w:tcPr>
+            <w:tcW w:w="3173" w:type="dxa"/>
+          </w:tcPr>
+          <w:p>
+            <w:pPr>
+              <w:spacing w:after="40"/>
+            </w:pPr>
+            <w:r>
+              <w:t>实际输出是简历修改计划、技能差距与职业路径（均须证据支撑）；删除未实现的多模板简历生成与</w:t>
+            </w:r>
+            <w:r>
+              <w:t xml:space="preserve"> PDF </w:t>
+            </w:r>
+            <w:r>
+              <w:t>导出。</w:t>
+            </w:r>
+          </w:p>
+        </w:tc>
+      </w:tr>
+    </w:tbl>
+    <w:p>
+      <w:pPr>
+        <w:spacing w:after="0"/>
+      </w:pPr>
+    </w:p>
+    <w:p>
+      <w:pPr>
         <w:pStyle w:val="1"/>
       </w:pPr>
       <w:r>
+        <w:lastRenderedPageBreak/>
         <w:t>模块一：简历归一化与证据链</w:t>
       </w:r>
     </w:p>
@@ -1074,7 +1632,6 @@
         <w:pStyle w:val="21"/>
       </w:pPr>
       <w:r>
-        <w:lastRenderedPageBreak/>
         <w:t>技术组成</w:t>
       </w:r>
     </w:p>
@@ -1239,6 +1796,7 @@
         <w:pStyle w:val="21"/>
       </w:pPr>
       <w:r>
+        <w:lastRenderedPageBreak/>
         <w:t>工程创新点</w:t>
       </w:r>
     </w:p>

</xml_diff>